<commit_message>
Update Lab 1 document
</commit_message>
<xml_diff>
--- a/LAB1_PES1UG24AM912.docx
+++ b/LAB1_PES1UG24AM912.docx
@@ -72,35 +72,164 @@
             <w:tcW w:w="3017" w:type="dxa"/>
           </w:tcPr>
           <w:p>
-            <w:proofErr w:type="gramStart"/>
             <w:r>
               <w:t>SEC :F</w:t>
             </w:r>
-            <w:proofErr w:type="gramEnd"/>
           </w:p>
         </w:tc>
       </w:tr>
     </w:tbl>
-    <w:p>
-      <w:r>
+    <w:p/>
+    <w:p>
+      <w:pPr>
+        <w:rPr>
+          <w:b/>
+          <w:bCs/>
+        </w:rPr>
+      </w:pPr>
+      <w:r>
+        <w:rPr>
+          <w:b/>
+          <w:bCs/>
+        </w:rPr>
+        <w:t>PROBLEM STATEMENT #61 | Sustainability &amp; Green Tech</w:t>
+      </w:r>
+    </w:p>
+    <w:p>
+      <w:pPr>
+        <w:rPr>
+          <w:b/>
+          <w:bCs/>
+        </w:rPr>
+      </w:pPr>
+      <w:r>
+        <w:rPr>
+          <w:b/>
+          <w:bCs/>
+        </w:rPr>
+        <w:t>Household Carbon Footprint &amp; Target Tracker</w:t>
+      </w:r>
+    </w:p>
+    <w:p>
+      <w:pPr>
+        <w:rPr>
+          <w:b/>
+          <w:bCs/>
+        </w:rPr>
+      </w:pPr>
+      <w:r>
+        <w:rPr>
+          <w:b/>
+          <w:bCs/>
+        </w:rPr>
+        <w:t>1. Problem Context &amp; Overview</w:t>
+      </w:r>
+    </w:p>
+    <w:p>
+      <w:pPr>
+        <w:rPr>
+          <w:b/>
+          <w:bCs/>
+        </w:rPr>
+      </w:pPr>
+      <w:r>
+        <w:rPr>
+          <w:b/>
+          <w:bCs/>
+        </w:rPr>
+        <w:t xml:space="preserve">A green living analytics tool where households log monthly utility consumption (kWh electricity, gas, </w:t>
+      </w:r>
+    </w:p>
+    <w:p>
+      <w:pPr>
+        <w:rPr>
+          <w:b/>
+          <w:bCs/>
+        </w:rPr>
+      </w:pPr>
+      <w:r>
+        <w:rPr>
+          <w:b/>
+          <w:bCs/>
+        </w:rPr>
+        <w:t>commute kilometers) to compute $CO_2$ equivalents and track reduction milestones.</w:t>
+      </w:r>
+    </w:p>
+    <w:p>
+      <w:pPr>
+        <w:rPr>
+          <w:b/>
+          <w:bCs/>
+        </w:rPr>
+      </w:pPr>
+      <w:r>
+        <w:rPr>
+          <w:b/>
+          <w:bCs/>
+        </w:rPr>
+        <w:t>Target Stakeholders / Actors: Resident, Sustainability Coach</w:t>
+      </w:r>
+    </w:p>
+    <w:p>
+      <w:pPr>
+        <w:rPr>
+          <w:b/>
+          <w:bCs/>
+        </w:rPr>
+      </w:pPr>
+      <w:r>
+        <w:rPr>
+          <w:b/>
+          <w:bCs/>
+        </w:rPr>
         <w:t>Requirements Table:</w:t>
+      </w:r>
+    </w:p>
+    <w:p>
+      <w:pPr>
+        <w:rPr>
+          <w:b/>
+          <w:bCs/>
+        </w:rPr>
+      </w:pPr>
+      <w:r>
+        <w:rPr>
+          <w:b/>
+          <w:bCs/>
+        </w:rPr>
+        <w:t>F</w:t>
+      </w:r>
+      <w:r>
+        <w:rPr>
+          <w:b/>
+          <w:bCs/>
+        </w:rPr>
+        <w:t>unctional requirement</w:t>
+      </w:r>
+      <w:r>
+        <w:rPr>
+          <w:b/>
+          <w:bCs/>
+        </w:rPr>
+        <w:t>(5):</w:t>
       </w:r>
     </w:p>
     <w:tbl>
       <w:tblPr>
         <w:tblStyle w:val="GridTable1Light"/>
+        <w:tblpPr w:leftFromText="180" w:rightFromText="180" w:vertAnchor="text" w:tblpX="-1423" w:tblpY="1"/>
+        <w:tblOverlap w:val="never"/>
         <w:tblW w:w="12758" w:type="dxa"/>
-        <w:tblInd w:w="-1423" w:type="dxa"/>
         <w:tblLayout w:type="fixed"/>
         <w:tblLook w:val="04A0" w:firstRow="1" w:lastRow="0" w:firstColumn="1" w:lastColumn="0" w:noHBand="0" w:noVBand="1"/>
       </w:tblPr>
       <w:tblGrid>
         <w:gridCol w:w="992"/>
         <w:gridCol w:w="1419"/>
-        <w:gridCol w:w="4961"/>
+        <w:gridCol w:w="3113"/>
         <w:gridCol w:w="1134"/>
-        <w:gridCol w:w="1701"/>
-        <w:gridCol w:w="2551"/>
+        <w:gridCol w:w="2409"/>
+        <w:gridCol w:w="3691"/>
       </w:tblGrid>
       <w:tr>
         <w:trPr>
@@ -118,21 +247,12 @@
                 <w:rFonts w:ascii="Arial" w:hAnsi="Arial" w:cs="Arial"/>
               </w:rPr>
             </w:pPr>
-            <w:proofErr w:type="spellStart"/>
             <w:r>
               <w:rPr>
                 <w:rStyle w:val="Strong"/>
                 <w:rFonts w:ascii="Arial" w:hAnsi="Arial" w:cs="Arial"/>
               </w:rPr>
-              <w:t>Req</w:t>
-            </w:r>
-            <w:proofErr w:type="spellEnd"/>
-            <w:r>
-              <w:rPr>
-                <w:rStyle w:val="Strong"/>
-                <w:rFonts w:ascii="Arial" w:hAnsi="Arial" w:cs="Arial"/>
-              </w:rPr>
-              <w:t xml:space="preserve"> ID</w:t>
+              <w:t>Req ID</w:t>
             </w:r>
           </w:p>
           <w:p/>
@@ -152,7 +272,7 @@
         </w:tc>
         <w:tc>
           <w:tcPr>
-            <w:tcW w:w="4961" w:type="dxa"/>
+            <w:tcW w:w="3113" w:type="dxa"/>
           </w:tcPr>
           <w:p>
             <w:pPr>
@@ -178,7 +298,7 @@
         </w:tc>
         <w:tc>
           <w:tcPr>
-            <w:tcW w:w="1701" w:type="dxa"/>
+            <w:tcW w:w="2409" w:type="dxa"/>
           </w:tcPr>
           <w:p>
             <w:pPr>
@@ -191,7 +311,7 @@
         </w:tc>
         <w:tc>
           <w:tcPr>
-            <w:tcW w:w="2551" w:type="dxa"/>
+            <w:tcW w:w="3691" w:type="dxa"/>
           </w:tcPr>
           <w:p>
             <w:pPr>
@@ -233,22 +353,14 @@
         </w:tc>
         <w:tc>
           <w:tcPr>
-            <w:tcW w:w="4961" w:type="dxa"/>
+            <w:tcW w:w="3113" w:type="dxa"/>
           </w:tcPr>
           <w:p>
             <w:pPr>
               <w:cnfStyle w:val="000000000000" w:firstRow="0" w:lastRow="0" w:firstColumn="0" w:lastColumn="0" w:oddVBand="0" w:evenVBand="0" w:oddHBand="0" w:evenHBand="0" w:firstRowFirstColumn="0" w:firstRowLastColumn="0" w:lastRowFirstColumn="0" w:lastRowLastColumn="0"/>
             </w:pPr>
             <w:r>
-              <w:t>The system shall ingest household monthly electricity (kWh) and transport (km) logs to compute total monthly carbon equivalent (</w:t>
-            </w:r>
-            <w:proofErr w:type="spellStart"/>
-            <w:r>
-              <w:t>CO₂e</w:t>
-            </w:r>
-            <w:proofErr w:type="spellEnd"/>
-            <w:r>
-              <w:t>) emissions.</w:t>
+              <w:t>The system shall ingest household monthly electricity (kWh) and transport (km) logs to compute total monthly carbon equivalent (CO₂e) emissions.</w:t>
             </w:r>
           </w:p>
         </w:tc>
@@ -267,7 +379,7 @@
         </w:tc>
         <w:tc>
           <w:tcPr>
-            <w:tcW w:w="1701" w:type="dxa"/>
+            <w:tcW w:w="2409" w:type="dxa"/>
           </w:tcPr>
           <w:p>
             <w:pPr>
@@ -297,14 +409,22 @@
         </w:tc>
         <w:tc>
           <w:tcPr>
-            <w:tcW w:w="2551" w:type="dxa"/>
+            <w:tcW w:w="3691" w:type="dxa"/>
           </w:tcPr>
           <w:p>
             <w:pPr>
               <w:cnfStyle w:val="000000000000" w:firstRow="0" w:lastRow="0" w:firstColumn="0" w:lastColumn="0" w:oddVBand="0" w:evenVBand="0" w:oddHBand="0" w:evenHBand="0" w:firstRowFirstColumn="0" w:firstRowLastColumn="0" w:lastRowFirstColumn="0" w:lastRowLastColumn="0"/>
             </w:pPr>
             <w:r>
-              <w:t>This is the core functionality for calculating the household's monthly carbon footprint.</w:t>
+              <w:t>This is the core functional</w:t>
+            </w:r>
+          </w:p>
+          <w:p>
+            <w:pPr>
+              <w:cnfStyle w:val="000000000000" w:firstRow="0" w:lastRow="0" w:firstColumn="0" w:lastColumn="0" w:oddVBand="0" w:evenVBand="0" w:oddHBand="0" w:evenHBand="0" w:firstRowFirstColumn="0" w:firstRowLastColumn="0" w:lastRowFirstColumn="0" w:lastRowLastColumn="0"/>
+            </w:pPr>
+            <w:r>
+              <w:t>ity for calculating the household's monthly carbon footprint.</w:t>
             </w:r>
           </w:p>
         </w:tc>
@@ -339,7 +459,7 @@
         </w:tc>
         <w:tc>
           <w:tcPr>
-            <w:tcW w:w="4961" w:type="dxa"/>
+            <w:tcW w:w="3113" w:type="dxa"/>
           </w:tcPr>
           <w:p>
             <w:pPr>
@@ -365,7 +485,7 @@
         </w:tc>
         <w:tc>
           <w:tcPr>
-            <w:tcW w:w="1701" w:type="dxa"/>
+            <w:tcW w:w="2409" w:type="dxa"/>
           </w:tcPr>
           <w:p>
             <w:pPr>
@@ -389,19 +509,24 @@
               <w:t>Fail:</w:t>
             </w:r>
             <w:r>
-              <w:t xml:space="preserve"> Missing, invalid, or negative values are stored.</w:t>
-            </w:r>
-          </w:p>
-        </w:tc>
-        <w:tc>
-          <w:tcPr>
-            <w:tcW w:w="2551" w:type="dxa"/>
+              <w:t xml:space="preserve"> </w:t>
+            </w:r>
+            <w:r>
+              <w:lastRenderedPageBreak/>
+              <w:t>Missing, invalid, or negative values are stored.</w:t>
+            </w:r>
+          </w:p>
+        </w:tc>
+        <w:tc>
+          <w:tcPr>
+            <w:tcW w:w="3691" w:type="dxa"/>
           </w:tcPr>
           <w:p>
             <w:pPr>
               <w:cnfStyle w:val="000000000000" w:firstRow="0" w:lastRow="0" w:firstColumn="0" w:lastColumn="0" w:oddVBand="0" w:evenVBand="0" w:oddHBand="0" w:evenHBand="0" w:firstRowFirstColumn="0" w:firstRowLastColumn="0" w:lastRowFirstColumn="0" w:lastRowLastColumn="0"/>
             </w:pPr>
             <w:r>
+              <w:lastRenderedPageBreak/>
               <w:t>The system requires monthly consumption data as input for carbon-emission calculation.</w:t>
             </w:r>
           </w:p>
@@ -437,22 +562,14 @@
         </w:tc>
         <w:tc>
           <w:tcPr>
-            <w:tcW w:w="4961" w:type="dxa"/>
+            <w:tcW w:w="3113" w:type="dxa"/>
           </w:tcPr>
           <w:p>
             <w:pPr>
               <w:cnfStyle w:val="000000000000" w:firstRow="0" w:lastRow="0" w:firstColumn="0" w:lastColumn="0" w:oddVBand="0" w:evenVBand="0" w:oddHBand="0" w:evenHBand="0" w:firstRowFirstColumn="0" w:firstRowLastColumn="0" w:lastRowFirstColumn="0" w:lastRowLastColumn="0"/>
             </w:pPr>
             <w:r>
-              <w:t xml:space="preserve">The system shall display the household's calculated monthly </w:t>
-            </w:r>
-            <w:proofErr w:type="spellStart"/>
-            <w:r>
-              <w:t>CO₂e</w:t>
-            </w:r>
-            <w:proofErr w:type="spellEnd"/>
-            <w:r>
-              <w:t xml:space="preserve"> emissions and historical emission data for comparison.</w:t>
+              <w:t>The system shall display the household's calculated monthly CO₂e emissions and historical emission data for comparison.</w:t>
             </w:r>
           </w:p>
         </w:tc>
@@ -471,7 +588,7 @@
         </w:tc>
         <w:tc>
           <w:tcPr>
-            <w:tcW w:w="1701" w:type="dxa"/>
+            <w:tcW w:w="2409" w:type="dxa"/>
           </w:tcPr>
           <w:p>
             <w:pPr>
@@ -485,19 +602,7 @@
               <w:t>Pass:</w:t>
             </w:r>
             <w:r>
-              <w:t xml:space="preserve"> The system displays the calculated </w:t>
-            </w:r>
-            <w:proofErr w:type="spellStart"/>
-            <w:r>
-              <w:t>CO₂e</w:t>
-            </w:r>
-            <w:proofErr w:type="spellEnd"/>
-            <w:r>
-              <w:t xml:space="preserve"> value for the selected month and </w:t>
-            </w:r>
-            <w:r>
-              <w:lastRenderedPageBreak/>
-              <w:t xml:space="preserve">previously recorded monthly values. </w:t>
+              <w:t xml:space="preserve"> The system displays the calculated CO₂e value for the selected month and previously recorded monthly values. </w:t>
             </w:r>
             <w:r>
               <w:rPr>
@@ -513,14 +618,13 @@
         </w:tc>
         <w:tc>
           <w:tcPr>
-            <w:tcW w:w="2551" w:type="dxa"/>
+            <w:tcW w:w="3691" w:type="dxa"/>
           </w:tcPr>
           <w:p>
             <w:pPr>
               <w:cnfStyle w:val="000000000000" w:firstRow="0" w:lastRow="0" w:firstColumn="0" w:lastColumn="0" w:oddVBand="0" w:evenVBand="0" w:oddHBand="0" w:evenHBand="0" w:firstRowFirstColumn="0" w:firstRowLastColumn="0" w:lastRowFirstColumn="0" w:lastRowLastColumn="0"/>
             </w:pPr>
             <w:r>
-              <w:lastRenderedPageBreak/>
               <w:t>Enables the Resident to understand and compare the household's carbon footprint over time.</w:t>
             </w:r>
           </w:p>
@@ -537,10 +641,7 @@
           </w:tcPr>
           <w:p>
             <w:r>
-              <w:t>FR-00</w:t>
-            </w:r>
-            <w:r>
-              <w:t>4</w:t>
+              <w:t>FR-004</w:t>
             </w:r>
           </w:p>
         </w:tc>
@@ -559,7 +660,7 @@
         </w:tc>
         <w:tc>
           <w:tcPr>
-            <w:tcW w:w="4961" w:type="dxa"/>
+            <w:tcW w:w="3113" w:type="dxa"/>
           </w:tcPr>
           <w:p>
             <w:pPr>
@@ -585,7 +686,7 @@
         </w:tc>
         <w:tc>
           <w:tcPr>
-            <w:tcW w:w="1701" w:type="dxa"/>
+            <w:tcW w:w="2409" w:type="dxa"/>
           </w:tcPr>
           <w:p>
             <w:pPr>
@@ -615,7 +716,7 @@
         </w:tc>
         <w:tc>
           <w:tcPr>
-            <w:tcW w:w="2551" w:type="dxa"/>
+            <w:tcW w:w="3691" w:type="dxa"/>
           </w:tcPr>
           <w:p>
             <w:pPr>
@@ -638,10 +739,7 @@
           </w:tcPr>
           <w:p>
             <w:r>
-              <w:t>FR-00</w:t>
-            </w:r>
-            <w:r>
-              <w:t>5</w:t>
+              <w:t>FR-005</w:t>
             </w:r>
           </w:p>
         </w:tc>
@@ -660,7 +758,7 @@
         </w:tc>
         <w:tc>
           <w:tcPr>
-            <w:tcW w:w="4961" w:type="dxa"/>
+            <w:tcW w:w="3113" w:type="dxa"/>
           </w:tcPr>
           <w:p>
             <w:pPr>
@@ -686,7 +784,7 @@
         </w:tc>
         <w:tc>
           <w:tcPr>
-            <w:tcW w:w="1701" w:type="dxa"/>
+            <w:tcW w:w="2409" w:type="dxa"/>
           </w:tcPr>
           <w:p>
             <w:pPr>
@@ -716,7 +814,7 @@
         </w:tc>
         <w:tc>
           <w:tcPr>
-            <w:tcW w:w="2551" w:type="dxa"/>
+            <w:tcW w:w="3691" w:type="dxa"/>
           </w:tcPr>
           <w:p>
             <w:pPr>
@@ -729,24 +827,19 @@
         </w:tc>
       </w:tr>
     </w:tbl>
+    <w:p>
+      <w:r>
+        <w:br w:type="textWrapping" w:clear="all"/>
+      </w:r>
+    </w:p>
     <w:p/>
     <w:p/>
     <w:p/>
+    <w:p/>
     <w:p>
       <w:r>
         <w:lastRenderedPageBreak/>
-        <w:t xml:space="preserve">Non-functional </w:t>
-      </w:r>
-      <w:proofErr w:type="gramStart"/>
-      <w:r>
-        <w:t>requirement(</w:t>
-      </w:r>
-      <w:proofErr w:type="gramEnd"/>
-      <w:r>
-        <w:t>2)</w:t>
-      </w:r>
-      <w:r>
-        <w:t>:</w:t>
+        <w:t>Non-functional requirement(2):</w:t>
       </w:r>
     </w:p>
     <w:tbl>
@@ -783,15 +876,7 @@
           </w:tcPr>
           <w:p>
             <w:r>
-              <w:t xml:space="preserve">The annual carbon reduction milestone chart must render interactive historical comparison graphs in under 200 </w:t>
-            </w:r>
-            <w:proofErr w:type="spellStart"/>
-            <w:r>
-              <w:t>ms</w:t>
-            </w:r>
-            <w:proofErr w:type="spellEnd"/>
-            <w:r>
-              <w:t>.</w:t>
+              <w:t>The annual carbon reduction milestone chart must render interactive historical comparison graphs in under 200 ms.</w:t>
             </w:r>
           </w:p>
         </w:tc>
@@ -825,17 +910,8 @@
                 <w:b/>
                 <w:bCs/>
               </w:rPr>
-              <w:t xml:space="preserve">less than 200 </w:t>
-            </w:r>
-            <w:proofErr w:type="spellStart"/>
-            <w:r>
-              <w:rPr>
-                <w:b/>
-                <w:bCs/>
-              </w:rPr>
-              <w:t>ms</w:t>
-            </w:r>
-            <w:proofErr w:type="spellEnd"/>
+              <w:t>less than 200 ms</w:t>
+            </w:r>
             <w:r>
               <w:t xml:space="preserve"> under the specified test conditions. </w:t>
             </w:r>
@@ -854,23 +930,7 @@
                 <w:b/>
                 <w:bCs/>
               </w:rPr>
-              <w:t xml:space="preserve">200 </w:t>
-            </w:r>
-            <w:proofErr w:type="spellStart"/>
-            <w:r>
-              <w:rPr>
-                <w:b/>
-                <w:bCs/>
-              </w:rPr>
-              <w:t>ms</w:t>
-            </w:r>
-            <w:proofErr w:type="spellEnd"/>
-            <w:r>
-              <w:rPr>
-                <w:b/>
-                <w:bCs/>
-              </w:rPr>
-              <w:t xml:space="preserve"> or longer</w:t>
+              <w:t>200 ms or longer</w:t>
             </w:r>
             <w:r>
               <w:t xml:space="preserve"> to render.</w:t>
@@ -1009,6 +1069,9 @@
     <w:p/>
     <w:p>
       <w:r>
+        <w:rPr>
+          <w:noProof/>
+        </w:rPr>
         <w:drawing>
           <wp:inline distT="0" distB="0" distL="0" distR="0" wp14:anchorId="20D16E63" wp14:editId="736F36AC">
             <wp:extent cx="4953000" cy="3587166"/>
@@ -1137,15 +1200,7 @@
         <w:t>Goal:</w:t>
       </w:r>
       <w:r>
-        <w:t xml:space="preserve"> To record the household's monthly electricity and transport consumption and calculate the corresponding monthly </w:t>
-      </w:r>
-      <w:proofErr w:type="spellStart"/>
-      <w:r>
-        <w:t>CO₂e</w:t>
-      </w:r>
-      <w:proofErr w:type="spellEnd"/>
-      <w:r>
-        <w:t xml:space="preserve"> emissions.</w:t>
+        <w:t xml:space="preserve"> To record the household's monthly electricity and transport consumption and calculate the corresponding monthly CO₂e emissions.</w:t>
       </w:r>
     </w:p>
     <w:p>
@@ -1241,15 +1296,7 @@
         </w:numPr>
       </w:pPr>
       <w:r>
-        <w:t xml:space="preserve">The system calculates the household's total monthly </w:t>
-      </w:r>
-      <w:proofErr w:type="spellStart"/>
-      <w:r>
-        <w:t>CO₂e</w:t>
-      </w:r>
-      <w:proofErr w:type="spellEnd"/>
-      <w:r>
-        <w:t xml:space="preserve"> emissions.</w:t>
+        <w:t>The system calculates the household's total monthly CO₂e emissions.</w:t>
       </w:r>
     </w:p>
     <w:p>
@@ -1260,15 +1307,7 @@
         </w:numPr>
       </w:pPr>
       <w:r>
-        <w:t xml:space="preserve">The calculated monthly </w:t>
-      </w:r>
-      <w:proofErr w:type="spellStart"/>
-      <w:r>
-        <w:t>CO₂e</w:t>
-      </w:r>
-      <w:proofErr w:type="spellEnd"/>
-      <w:r>
-        <w:t xml:space="preserve"> value is stored and available for historical comparison.</w:t>
+        <w:t>The calculated monthly CO₂e value is stored and available for historical comparison.</w:t>
       </w:r>
     </w:p>
     <w:p>
@@ -1404,21 +1443,12 @@
       <w:r>
         <w:t xml:space="preserve">The system applies the configured conversion factors to calculate the household's total monthly </w:t>
       </w:r>
-      <w:proofErr w:type="spellStart"/>
-      <w:r>
-        <w:rPr>
-          <w:b/>
-          <w:bCs/>
-        </w:rPr>
-        <w:t>CO₂e</w:t>
-      </w:r>
-      <w:proofErr w:type="spellEnd"/>
-      <w:r>
-        <w:rPr>
-          <w:b/>
-          <w:bCs/>
-        </w:rPr>
-        <w:t xml:space="preserve"> emissions</w:t>
+      <w:r>
+        <w:rPr>
+          <w:b/>
+          <w:bCs/>
+        </w:rPr>
+        <w:t>CO₂e emissions</w:t>
       </w:r>
       <w:r>
         <w:t>.</w:t>
@@ -1443,15 +1473,7 @@
         </w:numPr>
       </w:pPr>
       <w:r>
-        <w:t xml:space="preserve">The system stores the calculated monthly </w:t>
-      </w:r>
-      <w:proofErr w:type="spellStart"/>
-      <w:r>
-        <w:t>CO₂e</w:t>
-      </w:r>
-      <w:proofErr w:type="spellEnd"/>
-      <w:r>
-        <w:t xml:space="preserve"> value.</w:t>
+        <w:t>The system stores the calculated monthly CO₂e value.</w:t>
       </w:r>
     </w:p>
     <w:p>
@@ -1587,23 +1609,7 @@
           <w:b/>
           <w:bCs/>
         </w:rPr>
-        <w:t xml:space="preserve">7a. Invalid </w:t>
-      </w:r>
-      <w:proofErr w:type="spellStart"/>
-      <w:r>
-        <w:rPr>
-          <w:b/>
-          <w:bCs/>
-        </w:rPr>
-        <w:t>CO₂e</w:t>
-      </w:r>
-      <w:proofErr w:type="spellEnd"/>
-      <w:r>
-        <w:rPr>
-          <w:b/>
-          <w:bCs/>
-        </w:rPr>
-        <w:t xml:space="preserve"> Calculation</w:t>
+        <w:t>7a. Invalid CO₂e Calculation</w:t>
       </w:r>
     </w:p>
     <w:p>
@@ -1614,15 +1620,7 @@
         </w:numPr>
       </w:pPr>
       <w:r>
-        <w:t xml:space="preserve">At Step 8, the system detects that the calculated </w:t>
-      </w:r>
-      <w:proofErr w:type="spellStart"/>
-      <w:r>
-        <w:t>CO₂e</w:t>
-      </w:r>
-      <w:proofErr w:type="spellEnd"/>
-      <w:r>
-        <w:t xml:space="preserve"> value is zero or negative.</w:t>
+        <w:t>At Step 8, the system detects that the calculated CO₂e value is zero or negative.</w:t>
       </w:r>
     </w:p>
     <w:p>

</xml_diff>